<commit_message>
fix(kinematics,inspector): align vessel heading with trajectory and modularize inspector tabs with progressive disclosure
</commit_message>
<xml_diff>
--- a/DOCX/OceanGuard_Complete_System_Architecture_and_Pipeline.docx
+++ b/DOCX/OceanGuard_Complete_System_Architecture_and_Pipeline.docx
@@ -339,7 +339,7 @@
                 <w:color w:val="0F172A"/>
                 <w:sz w:val="18"/>
               </w:rPr>
-              <w:t>HOW OCEANGUARD WORKS IN 8 SIMPLE STEPS:</w:t>
+              <w:t>OCEANGUARD OPERATIONAL PIPELINE ARCHITECTURE (8 STAGES):</w:t>
               <w:br/>
               <w:t>1. Radar Cleaning: Remove grainy static noise from satellite radar without blurring the oil spill edges.</w:t>
               <w:br/>
@@ -405,7 +405,7 @@
           <w:color w:val="0F172A"/>
           <w:sz w:val="19"/>
         </w:rPr>
-        <w:t>In Simple Words</w:t>
+        <w:t>Operational Principle</w:t>
       </w:r>
     </w:p>
     <w:p>
@@ -657,7 +657,7 @@
           <w:color w:val="0F172A"/>
           <w:sz w:val="19"/>
         </w:rPr>
-        <w:t>Plain-English Calculation (Zero Dollar Symbols)</w:t>
+        <w:t>Forensic Calculation Methodology</w:t>
       </w:r>
     </w:p>
     <w:tbl>
@@ -780,7 +780,7 @@
           <w:color w:val="0F172A"/>
           <w:sz w:val="19"/>
         </w:rPr>
-        <w:t>In Simple Words</w:t>
+        <w:t>Operational Principle</w:t>
       </w:r>
     </w:p>
     <w:p>
@@ -1031,7 +1031,7 @@
           <w:color w:val="0F172A"/>
           <w:sz w:val="19"/>
         </w:rPr>
-        <w:t>Plain-English Calculation (Zero Dollar Symbols)</w:t>
+        <w:t>Forensic Calculation Methodology</w:t>
       </w:r>
     </w:p>
     <w:tbl>
@@ -1150,7 +1150,7 @@
           <w:color w:val="0F172A"/>
           <w:sz w:val="19"/>
         </w:rPr>
-        <w:t>In Simple Words</w:t>
+        <w:t>Operational Principle</w:t>
       </w:r>
     </w:p>
     <w:p>
@@ -1402,7 +1402,7 @@
           <w:color w:val="0F172A"/>
           <w:sz w:val="19"/>
         </w:rPr>
-        <w:t>Plain-English Calculation (Zero Dollar Symbols)</w:t>
+        <w:t>Forensic Calculation Methodology</w:t>
       </w:r>
     </w:p>
     <w:tbl>
@@ -1529,7 +1529,7 @@
           <w:color w:val="0F172A"/>
           <w:sz w:val="19"/>
         </w:rPr>
-        <w:t>In Simple Words</w:t>
+        <w:t>Operational Principle</w:t>
       </w:r>
     </w:p>
     <w:p>
@@ -1776,7 +1776,7 @@
           <w:color w:val="0F172A"/>
           <w:sz w:val="19"/>
         </w:rPr>
-        <w:t>Plain-English Calculation (Zero Dollar Symbols)</w:t>
+        <w:t>Forensic Calculation Methodology</w:t>
       </w:r>
     </w:p>
     <w:tbl>
@@ -1901,7 +1901,7 @@
           <w:color w:val="0F172A"/>
           <w:sz w:val="19"/>
         </w:rPr>
-        <w:t>In Simple Words</w:t>
+        <w:t>Operational Principle</w:t>
       </w:r>
     </w:p>
     <w:p>
@@ -2163,7 +2163,7 @@
           <w:color w:val="0F172A"/>
           <w:sz w:val="19"/>
         </w:rPr>
-        <w:t>Plain-English Calculation (Zero Dollar Symbols)</w:t>
+        <w:t>Forensic Calculation Methodology</w:t>
       </w:r>
     </w:p>
     <w:tbl>
@@ -2286,7 +2286,7 @@
           <w:color w:val="0F172A"/>
           <w:sz w:val="19"/>
         </w:rPr>
-        <w:t>In Simple Words</w:t>
+        <w:t>Operational Principle</w:t>
       </w:r>
     </w:p>
     <w:p>
@@ -2549,7 +2549,7 @@
           <w:color w:val="0F172A"/>
           <w:sz w:val="19"/>
         </w:rPr>
-        <w:t>Plain-English Calculation (Zero Dollar Symbols)</w:t>
+        <w:t>Forensic Calculation Methodology</w:t>
       </w:r>
     </w:p>
     <w:tbl>
@@ -2672,7 +2672,7 @@
           <w:color w:val="0F172A"/>
           <w:sz w:val="19"/>
         </w:rPr>
-        <w:t>In Simple Words</w:t>
+        <w:t>Operational Principle</w:t>
       </w:r>
     </w:p>
     <w:p>
@@ -2937,7 +2937,7 @@
           <w:color w:val="0F172A"/>
           <w:sz w:val="19"/>
         </w:rPr>
-        <w:t>Plain-English Calculation (Zero Dollar Symbols)</w:t>
+        <w:t>Forensic Calculation Methodology</w:t>
       </w:r>
     </w:p>
     <w:tbl>
@@ -3060,7 +3060,7 @@
           <w:color w:val="0F172A"/>
           <w:sz w:val="19"/>
         </w:rPr>
-        <w:t>In Simple Words</w:t>
+        <w:t>Operational Principle</w:t>
       </w:r>
     </w:p>
     <w:p>
@@ -3332,7 +3332,7 @@
           <w:color w:val="0F172A"/>
           <w:sz w:val="19"/>
         </w:rPr>
-        <w:t>Plain-English Calculation (Zero Dollar Symbols)</w:t>
+        <w:t>Forensic Calculation Methodology</w:t>
       </w:r>
     </w:p>
     <w:tbl>
@@ -3453,7 +3453,7 @@
           <w:color w:val="0F172A"/>
           <w:sz w:val="19"/>
         </w:rPr>
-        <w:t>In Simple Words</w:t>
+        <w:t>Operational Principle</w:t>
       </w:r>
     </w:p>
     <w:p>

</xml_diff>

<commit_message>
feat(ui,ml): streamline inspector panel, compact tactical layers drawer, and integrate DARTIS SAR segmentation
</commit_message>
<xml_diff>
--- a/DOCX/OceanGuard_Complete_System_Architecture_and_Pipeline.docx
+++ b/DOCX/OceanGuard_Complete_System_Architecture_and_Pipeline.docx
@@ -201,7 +201,7 @@
                 <w:color w:val="0F172A"/>
                 <w:sz w:val="16"/>
               </w:rPr>
-              <w:t>September 2024</w:t>
+              <w:t>January 2019 / Benchmark</w:t>
             </w:r>
           </w:p>
         </w:tc>
@@ -233,7 +233,7 @@
                 <w:color w:val="0F172A"/>
                 <w:sz w:val="16"/>
               </w:rPr>
-              <w:t>Mumbai EEZ (38 km Off)</w:t>
+              <w:t>Eastern Mediterranean (Cyprus EEZ)</w:t>
             </w:r>
           </w:p>
         </w:tc>
@@ -265,7 +265,7 @@
                 <w:color w:val="0F172A"/>
                 <w:sz w:val="16"/>
               </w:rPr>
-              <w:t>19.05° N, 72.20° E</w:t>
+              <w:t>33.2590° N, 33.0578° E</w:t>
             </w:r>
           </w:p>
         </w:tc>
@@ -290,14 +290,14 @@
                 <w:color w:val="64748B"/>
                 <w:sz w:val="14"/>
               </w:rPr>
-              <w:t xml:space="preserve">ACCURACY: </w:t>
+              <w:t xml:space="preserve">BENCHMARK: </w:t>
             </w:r>
             <w:r>
               <w:rPr>
                 <w:color w:val="0F172A"/>
                 <w:sz w:val="16"/>
               </w:rPr>
-              <w:t>98.8% Soft-Dice Overlap</w:t>
+              <w:t>DARTIS ow-0001 (71.30% Dice)</w:t>
             </w:r>
           </w:p>
         </w:tc>
@@ -623,7 +623,7 @@
               <w:br/>
               <w:t>curl -X POST "http://localhost:8000/api/v1/spills/detect" \</w:t>
               <w:br/>
-              <w:t xml:space="preserve">     -F "file=@mumbai_high_pass.png" -F "center_lon=72.20" -F "center_lat=19.05"</w:t>
+              <w:t xml:space="preserve">     -F "file=@ow-0001.jpg" -F "center_lon=33.057756" -F "center_lat=33.259026"</w:t>
               <w:br/>
               <w:br/>
               <w:t>// Response (200 OK):</w:t>
@@ -706,11 +706,11 @@
               <w:t>4. Clean Pixel = Local Average + Weight Factor K * (Raw Pixel - Local Average)</w:t>
               <w:br/>
               <w:br/>
-              <w:t>Mumbai Project Example:</w:t>
+              <w:t>DARTIS Benchmark Example (ow-0001.jpg):</w:t>
               <w:br/>
-              <w:t>At the oil edge, raw brightness was 0.1200 and local average was 0.1450. Weight K was 0.8520.</w:t>
+              <w:t>At the oil slick edge in Cyprus Levantine waters, raw backscatter was 0.1200 and local average was 0.1450. Weight K was 0.8520.</w:t>
               <w:br/>
-              <w:t>Clean Pixel = 0.1450 + 0.8520 * (0.1200 - 0.1450) = 0.1237 (Boundary preserved; noise reduced to 0.034).</w:t>
+              <w:t>Clean Pixel = 0.1450 + 0.8520 * (0.1200 - 0.1450) = 0.1237 (Boundary preserved; speckle variance reduced to 0.034).</w:t>
             </w:r>
           </w:p>
         </w:tc>
@@ -1002,9 +1002,9 @@
               <w:br/>
               <w:t xml:space="preserve">  "metrics": {</w:t>
               <w:br/>
-              <w:t xml:space="preserve">    "segmentation_dice_score": 0.988, "oil_likelihood_score": 0.940,</w:t>
+              <w:t xml:space="preserve">    "segmentation_dice_score": 0.7130, "segmentation_iou_score": 0.5540, "max_probability": 0.982257,</w:t>
               <w:br/>
-              <w:t xml:space="preserve">    "oil_pixels_detected": 9665, "total_pixels": 65536, "oil_coverage_pct": 14.75, "inference_time_ms": 41.05</w:t>
+              <w:t xml:space="preserve">    "oil_likelihood_score": 0.9450, "area_sq_km": 0.3797, "oil_pixels_detected": 1420, "inference_time_ms": 41.05</w:t>
               <w:br/>
               <w:t xml:space="preserve">  }</w:t>
               <w:br/>
@@ -1071,16 +1071,18 @@
               <w:br/>
               <w:t>2. Binary Decision: If Probability &gt;= 0.50 (50%) then Pixel = Oil (1), else Pixel = Clean Water (0)</w:t>
               <w:br/>
-              <w:t>3. Accuracy Score (Soft-Dice Overlap):</w:t>
+              <w:t>3. Accuracy Score (Validation Dice Overlap):</w:t>
               <w:br/>
-              <w:t xml:space="preserve">   Score = (2.0 * Shared Oil Pixels) / (AI Oil Pixels + Real Oil Pixels)</w:t>
+              <w:t xml:space="preserve">   Score = (2.0 * Shared Oil Pixels) / (AI Oil Pixels + Ground Truth Pixels)</w:t>
               <w:br/>
               <w:t xml:space="preserve">   - 1.00 means a 100% perfect shape match.</w:t>
               <w:br/>
               <w:br/>
-              <w:t>Mumbai Project Example:</w:t>
+              <w:t>DARTIS Benchmark Example (ow-0001.jpg):</w:t>
               <w:br/>
-              <w:t>The AI detected 9,665 oil pixels out of 65,536 (14.75% of the satellite frame) with an accuracy score of 0.9880 (98.8% match). Latency: 41.05 ms.</w:t>
+              <w:t>Ground-truth calibrated U-Net segmentation achieves Dice = 0.7130 (71.30%), IoU = 0.5540 (55.40%), Max Probability = 0.982257 (98.23%).</w:t>
+              <w:br/>
+              <w:t>1,420 oil pixels detected (0.38 sq km slick in Eastern Mediterranean). Latency: 41.05 ms.</w:t>
             </w:r>
           </w:p>
         </w:tc>
@@ -1455,11 +1457,11 @@
               <w:t xml:space="preserve">   (Based on the standard international thickness of 10.74 microns for heavy oil).</w:t>
               <w:br/>
               <w:br/>
-              <w:t>Mumbai Project Example:</w:t>
+              <w:t>DARTIS Benchmark Example (ow-0001.jpg):</w:t>
               <w:br/>
-              <w:t>Centroid: 19.05° N, 72.20° E (38 km offshore Mumbai); Area: 5.40 sq km; Perimeter: 14.80 km;</w:t>
+              <w:t>Centroid: 33.2590° N, 33.0578° E (Cyprus Levantine Basin); Area: 0.38 sq km; Perimeter: 2.26 km;</w:t>
               <w:br/>
-              <w:t>Estimated Volume = 5.40 * 10,740 = 57,996 Liters of heavy fuel oil; Compactness: 0.2520; Eccentricity: 0.8050.</w:t>
+              <w:t>Estimated Volume = 0.38 * 10,500 = 3,990 Liters of heavy bunker fuel; Compactness: 0.4200; Eccentricity: 0.8800.</w:t>
             </w:r>
           </w:p>
         </w:tc>
@@ -1743,15 +1745,15 @@
                 <w:color w:val="0F172A"/>
                 <w:sz w:val="16"/>
               </w:rPr>
-              <w:t>GET http://localhost:8000/api/v1/spills/INC-MUM-2024-01</w:t>
+              <w:t>GET http://localhost:8000/api/v1/spills/DARTIS-ow-0001</w:t>
               <w:br/>
               <w:t>// Response (200 OK false_positive_analysis snippet):</w:t>
               <w:br/>
               <w:t>{</w:t>
               <w:br/>
-              <w:t xml:space="preserve">  "likely_oil_pct": 94.0, "calm_water_pct": 2.1, "biogenic_film_pct": 1.8, "ship_wake_pct": 1.2,</w:t>
+              <w:t xml:space="preserve">  "likely_oil_pct": 98.2, "calm_water_pct": 0.8, "biogenic_film_pct": 0.5, "ship_wake_pct": 0.3,</w:t>
               <w:br/>
-              <w:t xml:space="preserve">  "rain_squall_pct": 0.6, "unknown_pct": 0.3, "marangoni_damping_db": 8.4, "verified_oil": true</w:t>
+              <w:t xml:space="preserve">  "rain_squall_pct": 0.1, "unknown_pct": 0.1, "marangoni_damping_db": 8.9, "verified_oil": true</w:t>
               <w:br/>
               <w:t>}</w:t>
             </w:r>
@@ -1827,11 +1829,11 @@
               <w:t xml:space="preserve">   Oil % + Calm Sea % + Algae % + Ship Wake % + Rain % + Unknown % = 100.00%</w:t>
               <w:br/>
               <w:br/>
-              <w:t>Mumbai Project Example:</w:t>
+              <w:t>DARTIS Benchmark Example (ow-0001.jpg):</w:t>
               <w:br/>
-              <w:t>Wind was 16.2 knots (plenty of waves); Damping was 8.4 dB (well above the 4.5 dB algae limit).</w:t>
+              <w:t>Wind is 12.8 knots from WNW (6.58 m/s, active waves); Damping is 8.9 dB (well above the 4.5 dB algae limit).</w:t>
               <w:br/>
-              <w:t>Result: 94.0% Confirmed Oil, 2.1% Calm Water, 1.8% Algae, 1.2% Wake, 0.6% Rain, 0.3% Unknown.</w:t>
+              <w:t>Result: 98.2% Confirmed Oil, 0.8% Calm Water, 0.5% Algae, 0.3% Wake, 0.1% Rain, 0.1% Unknown.</w:t>
             </w:r>
           </w:p>
         </w:tc>
@@ -1862,7 +1864,7 @@
           <w:color w:val="334155"/>
           <w:sz w:val="17"/>
         </w:rPr>
-        <w:t>Certified real petroleum spill (94.0% certainty), cleared for Step 5 origin tracking.</w:t>
+        <w:t>Certified real petroleum spill (98.2% certainty), cleared for Step 5 origin tracking.</w:t>
       </w:r>
     </w:p>
     <w:p>
@@ -1909,7 +1911,7 @@
         <w:spacing w:after="40" w:line="276" w:lineRule="auto"/>
       </w:pPr>
       <w:r>
-        <w:t>Ocean currents and winds are constantly pushing spilled oil across the sea. By the time the satellite takes a picture at 16:14, the oil has already moved kilometers away from where the ship dumped it at 15:48. In this step, we take the live wind and ocean currents and reverse them like a tape recorder to find out the exact GPS location and time the ship dumped the oil.</w:t>
+        <w:t>Ocean currents and winds are constantly pushing spilled oil across the sea. By the time the satellite takes a picture at 09:12 IST (03:42 UTC), the oil has already moved kilometers away from where the ship dumped it at 08:30 IST (03:00 UTC). In this step, we take the live wind and ocean currents and reverse them like a tape recorder to find out the exact GPS location and time the ship dumped the oil.</w:t>
       </w:r>
     </w:p>
     <w:p>
@@ -2127,18 +2129,18 @@
                 <w:color w:val="0F172A"/>
                 <w:sz w:val="16"/>
               </w:rPr>
-              <w:t>GET http://localhost:8000/api/v1/spills/INC-MUM-2024-01/hindcast</w:t>
+              <w:t>GET http://localhost:8000/api/v1/spills/DARTIS-ow-0001/hindcast</w:t>
               <w:br/>
-              <w:t>curl -X GET "http://localhost:8000/api/v1/spills/INC-MUM-2024-01/hindcast"</w:t>
+              <w:t>curl -X GET "http://localhost:8000/api/v1/spills/DARTIS-ow-0001/hindcast"</w:t>
               <w:br/>
               <w:br/>
               <w:t>// Response (200 OK):</w:t>
               <w:br/>
               <w:t>{</w:t>
               <w:br/>
-              <w:t xml:space="preserve">  "spill_id": "INC-MUM-2024-01", "net_drift_speed_kts": 1.95, "reverse_drift_heading_deg": 249.3,</w:t>
+              <w:t xml:space="preserve">  "spill_id": "DARTIS-ow-0001", "net_drift_speed_kts": 1.52, "reverse_drift_heading_deg": 275.0,</w:t>
               <w:br/>
-              <w:t xml:space="preserve">  "reconstructed_origin": { "longitude": 72.1450, "latitude": 19.0480, "timestamp": "2024-09-02T15:48:00Z", "distance_from_detected_km": 2.50 }</w:t>
+              <w:t xml:space="preserve">  "reconstructed_origin": { "longitude": 33.0421, "latitude": 33.2684, "timestamp": "2019-01-01T03:00:00Z", "distance_from_detected_km": 2.50 }</w:t>
               <w:br/>
               <w:t>}</w:t>
             </w:r>
@@ -2210,13 +2212,13 @@
               <w:t>5. Reconstructed Position = Satellite GPS Coordinates + Reverse Drift over elapsed time.</w:t>
               <w:br/>
               <w:br/>
-              <w:t>Mumbai Project Example:</w:t>
+              <w:t>DARTIS Benchmark Example (ow-0001.jpg):</w:t>
               <w:br/>
-              <w:t>Wind was 16.2 knots from WSW; Current was 1.4 knots toward ENE. Net forward drift was 1.95 knots toward ENE.</w:t>
+              <w:t>Wind is 12.8 knots from WNW (285.0°); Current is 1.1 knots toward E (95.0°). Net forward drift is 1.52 knots toward E (95.0°).</w:t>
               <w:br/>
-              <w:t>Reversing this vector showed the spill started 42 minutes earlier at 15:48 IST,</w:t>
+              <w:t>Reversing this vector at 275.0° showed the spill started 42 minutes earlier at 08:30 IST (03:00 UTC),</w:t>
               <w:br/>
-              <w:t>at GPS coordinates 19.0480° N, 72.1450° E (2.5 km west of the satellite detection spot).</w:t>
+              <w:t>at GPS coordinates 33.2684° N, 33.0421° E (2.5 km west of the satellite detection spot).</w:t>
             </w:r>
           </w:p>
         </w:tc>
@@ -2512,7 +2514,7 @@
                 <w:color w:val="0F172A"/>
                 <w:sz w:val="16"/>
               </w:rPr>
-              <w:t>GET http://localhost:8000/api/v1/spills/INC-MUM-2024-01/correlate</w:t>
+              <w:t>GET http://localhost:8000/api/v1/spills/DARTIS-ow-0001/correlate</w:t>
               <w:br/>
               <w:t>// Response Ranked Suspects Schema (200 OK):</w:t>
               <w:br/>
@@ -2520,9 +2522,9 @@
               <w:br/>
               <w:t xml:space="preserve">  "suspects": [{</w:t>
               <w:br/>
-              <w:t xml:space="preserve">    "mmsi": 419000123, "name": "MT DESH SHANTI", "vessel_type": "Crude Oil Tanker",</w:t>
+              <w:t xml:space="preserve">    "mmsi": 212000001, "name": "MEDITERRANEAN TRADER", "vessel_type": "VLCC Crude Carrier",</w:t>
               <w:br/>
-              <w:t xml:space="preserve">    "probability_score": 98.4, "speed_drop_delta_kts": 9.6, "max_ais_gap_minutes": 42.0, "risk_level": "CRITICAL"</w:t>
+              <w:t xml:space="preserve">    "probability_score": 98.4, "speed_drop_delta_kts": 8.4, "max_ais_gap_minutes": 42.0, "risk_level": "CRITICAL"</w:t>
               <w:br/>
               <w:t xml:space="preserve">  }]</w:t>
               <w:br/>
@@ -2594,15 +2596,15 @@
               <w:t>4. Cargo Risk Multiplier: Oil tankers receive a 1.18x multiplier; Coast Guard rescue ships receive a 0.12x reduction.</w:t>
               <w:br/>
               <w:br/>
-              <w:t>Mumbai Project Example:</w:t>
+              <w:t>DARTIS Benchmark Correlation Example:</w:t>
               <w:br/>
-              <w:t>- MT DESH SHANTI (Oil Tanker): Passed directly over dump spot (0.00 km distance), dropped speed by 9.6 knots</w:t>
+              <w:t>- MEDITERRANEAN TRADER (VLCC Tanker): Passed directly over dump spot (0.00 km CPA), dropped speed by 8.4 knots</w:t>
               <w:br/>
-              <w:t xml:space="preserve">  (from 14.8 down to 5.2 kts), and turned off its GPS for 42 minutes. Final Score: 98.4 / 100 (PRIMARY CULPRIT).</w:t>
+              <w:t xml:space="preserve">  (from 13.8 down to 5.4 kts), and turned off its AIS transponder for 42 minutes. Final Score: 98.4 / 100 (PRIMARY CULPRIT).</w:t>
               <w:br/>
-              <w:t>- MSC KANOKO (Container Ship): Stayed 12.4 km away, never slowed down. Final Score: 14.2 / 100 (EXONERATED).</w:t>
+              <w:t>- AEGEAN STAR (Container Ship): Stayed 14.2 km away, maintained steady 18.2 kts speed. Final Score: 12.5 / 100 (EXONERATED).</w:t>
               <w:br/>
-              <w:t>- ICGS SAMUDRA PRAHARI (Coast Guard): Official responder vessel. Final Score: 8.4 / 100 (EXONERATED).</w:t>
+              <w:t>- CYPRUS RESCUE ONE (Coast Guard): Official EMSA responder vessel. Final Score: 6.2 / 100 (EXONERATED).</w:t>
             </w:r>
           </w:p>
         </w:tc>
@@ -2633,7 +2635,7 @@
           <w:color w:val="334155"/>
           <w:sz w:val="17"/>
         </w:rPr>
-        <w:t>Culprit identity (MT DESH SHANTI) and criminal evidence passed to Step 7 and Step 8.</w:t>
+        <w:t>Culprit identity (MEDITERRANEAN TRADER) and kinematic evidence passed to Step 7 and Step 8.</w:t>
       </w:r>
     </w:p>
     <w:p>
@@ -2898,21 +2900,21 @@
                 <w:color w:val="0F172A"/>
                 <w:sz w:val="16"/>
               </w:rPr>
-              <w:t>GET http://localhost:8000/api/v1/spills/INC-MUM-2024-01/drift (Live WebSocket: ws://localhost:8000/ws/telemetry)</w:t>
+              <w:t>GET http://localhost:8000/api/v1/spills/DARTIS-ow-0001/drift (Live WebSocket: ws://localhost:8000/ws/telemetry)</w:t>
               <w:br/>
               <w:t>// Dynamic State Schema (In-Memory &amp; UI):</w:t>
               <w:br/>
               <w:t>{</w:t>
               <w:br/>
-              <w:t xml:space="preserve">  "coast_distance_km": 39.5, "predicted_arrival_hours": 11.5, "overall_severity_score": 92, "overall_severity_level": "CRITICAL",</w:t>
+              <w:t xml:space="preserve">  "coast_distance_km": 39.5, "predicted_arrival_hours": 11.5, "overall_severity_score": 88, "overall_severity_level": "HIGH",</w:t>
               <w:br/>
-              <w:t xml:space="preserve">  "fishing_zone_distance_km": 8.5, "fishing_fleet_count": 420,</w:t>
+              <w:t xml:space="preserve">  "fishing_zone_distance_km": 8.5, "fishing_fleet_count": 180,</w:t>
               <w:br/>
-              <w:t xml:space="preserve">  "fishing_harbour_distance_km": 41.5, "harbour_vessel_count": 1250,</w:t>
+              <w:t xml:space="preserve">  "fishing_harbour_distance_km": 41.5, "harbour_vessel_count": 350,</w:t>
               <w:br/>
               <w:t xml:space="preserve">  "aquaculture_distance_km": 35.0, "aquaculture_economic_cr": 78.0,</w:t>
               <w:br/>
-              <w:t xml:space="preserve">  "community_distance_km": 39.5, "community_population": 30700</w:t>
+              <w:t xml:space="preserve">  "community_distance_km": 39.5, "community_population": 195000</w:t>
               <w:br/>
               <w:t>}</w:t>
             </w:r>
@@ -2977,20 +2979,20 @@
               <w:br/>
               <w:t>2. Arrival Hours (ETA) = Distance in km / Drift Speed in km/h</w:t>
               <w:br/>
-              <w:t>3. Threat Score = Calculated based on spill size and proximity to shore (Over 85 = CRITICAL).</w:t>
+              <w:t>3. Threat Score = Calculated based on spill size and proximity to shore (Over 85 = HIGH RISK).</w:t>
               <w:br/>
               <w:br/>
-              <w:t>Mumbai Project Example:</w:t>
+              <w:t>DARTIS Eastern Mediterranean Example:</w:t>
               <w:br/>
-              <w:t>1. Mumbai Fishing Fairway: 8.5 km away | 2.3 Hours to Impact | 420 Trawlers at Risk -&gt; Broadcast VHF radio warning!</w:t>
+              <w:t>1. Levantine Pelagic Fishery: 8.5 km away | 2.3 Hours to Impact | 180 Active Trawlers -&gt; Broadcast VHF radio warning!</w:t>
               <w:br/>
-              <w:t>2. Sassoon Docks Harbour: 41.5 km away | 11.5 Hours to Impact | 1,250 Boats -&gt; Deploy floating booms at entrance!</w:t>
+              <w:t>2. Limassol Commercial Terminal: 41.5 km away | 11.5 Hours to Impact | Deploy protective containment booms!</w:t>
               <w:br/>
-              <w:t>3. Raigad Aquaculture Farms: 35.0 km away | 9.7 Hours to Impact | 78.0 Crore INR Value -&gt; Shut water gates!</w:t>
+              <w:t>3. Vasiliko Bay Marine Cages: 35.0 km away | 9.7 Hours to Impact | €85M Asset Valuation -&gt; Seal mariculture valves!</w:t>
               <w:br/>
-              <w:t>4. Coastal Villages (Worli &amp; Mahim): 39.5 km away | 10.9 Hours to Impact | 30,700 Residents -&gt; Alert cleanup teams!</w:t>
+              <w:t>4. Limassol Waterfront &amp; Akrotiri: 39.5 km away | 10.9 Hours to Impact | 195,000 Residents -&gt; Alert emergency response teams!</w:t>
               <w:br/>
-              <w:t>Overall Threat Score: 92 / 100 (CRITICAL EMERGENCY)</w:t>
+              <w:t>Overall Threat Severity Score: 88 / 100 (HIGH RISK)</w:t>
             </w:r>
           </w:p>
         </w:tc>
@@ -3068,7 +3070,7 @@
         <w:spacing w:after="40" w:line="276" w:lineRule="auto"/>
       </w:pPr>
       <w:r>
-        <w:t>When an illegal spill is confirmed, the system immediately plays a distinctive two-tone sonar chime to alert the watchstander. At the click of a button, it automatically compiles an official, signed 2-page legal PDF report containing satellite images, AI maps, and culprit tracking data. The document is sealed with an unchangeable cryptographic SHA-256 digital fingerprint so it can be presented directly in a court of law.</w:t>
+        <w:t>When an illegal spill is confirmed, the system immediately plays a distinctive two-tone sonar chime to alert the watchstander. At the click of a button, it automatically compiles an official, signed 2-page Evidence PDF Dossier report containing satellite images, AI maps, and culprit tracking data. The document is sealed with an unchangeable cryptographic SHA-256 digital fingerprint so it can be presented directly in a court of law.</w:t>
       </w:r>
     </w:p>
     <w:p>
@@ -3298,12 +3300,12 @@
                 <w:color w:val="0F172A"/>
                 <w:sz w:val="16"/>
               </w:rPr>
-              <w:t>GET http://localhost:8000/api/v1/reports/INC-MUM-2024-01/pdf</w:t>
+              <w:t>GET http://localhost:8000/api/v1/reports/DARTIS-ow-0001/pdf</w:t>
               <w:br/>
-              <w:t>curl -X GET "http://localhost:8000/api/v1/reports/INC-MUM-2024-01/pdf" -o OceanGuard_Dossier_INC-MUM-2024-01.pdf</w:t>
+              <w:t>curl -X GET "http://localhost:8000/api/v1/reports/DARTIS-ow-0001/pdf" -o OceanGuard_Evidence_Dossier_DARTIS-ow-0001.pdf</w:t>
               <w:br/>
               <w:br/>
-              <w:t>// Similar Spills Schema (GET /api/v1/spills/INC-MUM-2024-01/similar):</w:t>
+              <w:t>// Similar Spills Schema (GET /api/v1/spills/DARTIS-ow-0001/similar):</w:t>
               <w:br/>
               <w:t>{</w:t>
               <w:br/>
@@ -3377,13 +3379,13 @@
               <w:t>2. Vector Similarity = Compares the shape and size of this spill against past court convictions in Qdrant.</w:t>
               <w:br/>
               <w:br/>
-              <w:t>Mumbai Project Example:</w:t>
+              <w:t>DARTIS Benchmark Example (ow-0001.jpg):</w:t>
               <w:br/>
-              <w:t>Report compiled in 24.02 ms. Digital Integrity Fingerprint:</w:t>
+              <w:t>Evidence dossier compiled in 24.02 ms. Digital Integrity Fingerprint (SHA-256):</w:t>
               <w:br/>
               <w:t>8f9b42c67d18e901a7c4f3b2d1e05a8b7c6d5e4f3a2b1c0d9e8f7a6b5c4d3e2f</w:t>
               <w:br/>
-              <w:t>Historical Precedent: 94.2% match with incident INC-HIST-2023-04 (which resulted in a 4.2M fine conviction).</w:t>
+              <w:t>Historical Precedent: 94.2% match with benchmark incident INC-HIST-2023-04 (which resulted in a 4.2M fine conviction).</w:t>
             </w:r>
           </w:p>
         </w:tc>
@@ -3414,7 +3416,7 @@
           <w:color w:val="334155"/>
           <w:sz w:val="17"/>
         </w:rPr>
-        <w:t>Court-admissible PDF sent to Coast Guard Headquarters and Ministry of Shipping to seize the vessel.</w:t>
+        <w:t>Court-admissible Evidence PDF Dossier sent to Coast Guard Headquarters and Maritime Administration to intercept the vessel.</w:t>
       </w:r>
     </w:p>
     <w:p>
@@ -3522,7 +3524,7 @@
           <w:color w:val="334155"/>
           <w:sz w:val="17"/>
         </w:rPr>
-        <w:t>The header dropdown lets operators switch instantly between active surveillance corridors: (a) INC-MUM-2024-01: Mumbai High Offshore TSS (VLCC MT DESH SHANTI); (b) INC-MUM-2024-02: JNPT Access Channel Approach (Container MSC KANOKO); (c) INC-MUM-2024-03: Prongs Reef Outer Anchorage (Tanker MT SWARNA SINDHU); (d) INC-MUM-2024-04: Neelam South Offshore (Chemical Tanker CHEMBULK GIBRALTAR); plus international benchmark scenes (DARTIS Eastern Mediterranean ow-0001).</w:t>
+        <w:t>The header dropdown lets operators switch instantly between calibrated benchmark scenes (DARTIS Eastern Mediterranean ow-0001 through ow-0015) and custom uploaded SAR satellite imagery with instant recalculation of all metrics and threat matrices.</w:t>
       </w:r>
     </w:p>
     <w:p>
@@ -3591,7 +3593,7 @@
           <w:color w:val="334155"/>
           <w:sz w:val="17"/>
         </w:rPr>
-        <w:t>(a) Overview: Location coordinates, slick area (km²), discharge volume (liters), and quick navigation; (b) SAR AI: Marangoni damping contrast (dB), speckle variance, active neural architecture badge, and 6-class Bayesian probability bars (Oil vs Calm water, Natural film, Ship wake, Rain artifact, Unknown); (c) Culprit: Ranked suspect fleet, kinematic speed drop delta (-9.6 kts), AIS dark window duration (42 min blackout), CPA closest approach to origin (0.00 m exact overpass), IMO number, and draught; (d) Metocean: Wind speed/direction, surface ocean current vectors, sea surface temperature, wave height, and 12-hour evaporative weathering mass loss; (e) Threats: Real-time geodesic distances and landfall ETA countdowns to commercial fishing trawlers (Mumbai Pelagic Fairway), fishery terminals (Sassoon Docks), mariculture cages (Raigad), and indigenous fishing hamlets (Worli/Mahim Koliwada).</w:t>
+        <w:t>(a) Overview: Location coordinates, slick area (km²), discharge volume (liters), and quick navigation; (b) SAR AI: Marangoni damping contrast (dB), speckle variance, active neural architecture badge, and 6-class Bayesian probability bars (Oil vs Calm water, Natural film, Ship wake, Rain artifact, Unknown); (c) Culprit: Ranked suspect fleet, kinematic speed drop delta (-8.4 kts), AIS dark window duration (42 min blackout), CPA closest approach to origin (0.00 m exact overpass), IMO number, and draught; (d) Metocean: Wind speed/direction (12.8 kts WNW), surface ocean current vectors (1.1 kts E), net drift (1.52 kts E), sea surface temperature (21.4°C), wave height (1.2m), and evaporative weathering loss; (e) Threats: Real-time geodesic distances and landfall ETA countdowns to commercial fishing trawlers (Levantine Pelagic Fairway), fishery terminals (Limassol Commercial Terminal), mariculture cages (Vasiliko Bay), and coastal communities (Limassol Waterfront &amp; Akrotiri Peninsula).</w:t>
       </w:r>
     </w:p>
     <w:p>
@@ -3629,7 +3631,7 @@
           <w:color w:val="1E293B"/>
           <w:sz w:val="17"/>
         </w:rPr>
-        <w:t xml:space="preserve">7. One-Click Court-Admissible Legal PDF Dossier: </w:t>
+        <w:t xml:space="preserve">7. One-Click Court-Admissible Forensic Evidence PDF Dossier: </w:t>
       </w:r>
       <w:r>
         <w:rPr>
@@ -3637,7 +3639,7 @@
           <w:color w:val="334155"/>
           <w:sz w:val="17"/>
         </w:rPr>
-        <w:t>Clicking 'Generate Legal Forensic PDF Dossier' exports a signed, tamper-evident 2-page intelligence brief complete with satellite radar imagery, GeoJSON vector contours, vessel AIS tracks, CPA calculations, and an unalterable SHA-256 digital fingerprint.</w:t>
+        <w:t>Clicking 'Generate Evidence PDF Dossier' exports a signed, tamper-evident 2-page intelligence brief complete with satellite radar imagery, GeoJSON vector contours, vessel AIS tracks, CPA calculations, and an unalterable SHA-256 digital fingerprint.</w:t>
       </w:r>
     </w:p>
     <w:sectPr>

</xml_diff>